<commit_message>
moving ITERATION_PLAN TO README and CLAUDE:
</commit_message>
<xml_diff>
--- a/docs/phase1/dbmigrate/iteration1/MigrationVerificationReport1.docx
+++ b/docs/phase1/dbmigrate/iteration1/MigrationVerificationReport1.docx
@@ -94,7 +94,7 @@
         <w:spacing w:after="40"/>
       </w:pPr>
       <w:r>
-        <w:t xml:space="preserve">Run date (UTC): 2026-09-22 17:16:35</w:t>
+        <w:t xml:space="preserve">Run date (UTC): 2026-09-24 09:36:10</w:t>
       </w:r>
     </w:p>
     <w:p>
@@ -118,7 +118,7 @@
         <w:spacing w:after="240"/>
       </w:pPr>
       <w:r>
-        <w:t xml:space="preserve">Tooling version: git commit 324ddff</w:t>
+        <w:t xml:space="preserve">Tooling version: git commit dde75c0</w:t>
       </w:r>
     </w:p>
     <w:p>
@@ -4456,7 +4456,7 @@
           <w:b/>
           <w:color w:val="1F3864"/>
         </w:rPr>
-        <w:t xml:space="preserve">tools\dbmigrate\dbmigrate.cmd all --target sqlite</w:t>
+        <w:t xml:space="preserve">tools\phase1\dbmigrate\dbmigrate.cmd all --target sqlite</w:t>
       </w:r>
     </w:p>
     <w:p>
@@ -4559,7 +4559,7 @@
               <w:pStyle w:val="TableText"/>
             </w:pPr>
             <w:r>
-              <w:t xml:space="preserve">324ddff</w:t>
+              <w:t xml:space="preserve">dde75c0</w:t>
             </w:r>
           </w:p>
         </w:tc>
@@ -4658,7 +4658,7 @@
               <w:pStyle w:val="TableText"/>
             </w:pPr>
             <w:r>
-              <w:t xml:space="preserve">2026-09-22 17:16:35</w:t>
+              <w:t xml:space="preserve">2026-09-24 09:36:10</w:t>
             </w:r>
           </w:p>
         </w:tc>
@@ -5818,7 +5818,7 @@
       <w:jc w:val="center"/>
     </w:pPr>
     <w:r>
-      <w:t xml:space="preserve">Commit 324ddff | 2026-09-22 17:16:35 UTC   |   Page </w:t>
+      <w:t xml:space="preserve">Commit dde75c0 | 2026-09-24 09:36:10 UTC   |   Page </w:t>
     </w:r>
     <w:r>
       <w:fldChar w:fldCharType="begin"/>

</xml_diff>

<commit_message>
Reran iterations 1,2 and 4 after reformating the README and CLAUDE files
</commit_message>
<xml_diff>
--- a/docs/phase1/dbmigrate/iteration1/MigrationVerificationReport1.docx
+++ b/docs/phase1/dbmigrate/iteration1/MigrationVerificationReport1.docx
@@ -94,7 +94,7 @@
         <w:spacing w:after="40"/>
       </w:pPr>
       <w:r>
-        <w:t xml:space="preserve">Run date (UTC): 2026-09-24 09:36:10</w:t>
+        <w:t xml:space="preserve">Run date (UTC): 2026-09-24 12:39:39</w:t>
       </w:r>
     </w:p>
     <w:p>
@@ -118,7 +118,7 @@
         <w:spacing w:after="240"/>
       </w:pPr>
       <w:r>
-        <w:t xml:space="preserve">Tooling version: git commit dde75c0</w:t>
+        <w:t xml:space="preserve">Tooling version: git commit 1261f5f</w:t>
       </w:r>
     </w:p>
     <w:p>
@@ -4559,7 +4559,7 @@
               <w:pStyle w:val="TableText"/>
             </w:pPr>
             <w:r>
-              <w:t xml:space="preserve">dde75c0</w:t>
+              <w:t xml:space="preserve">1261f5f</w:t>
             </w:r>
           </w:p>
         </w:tc>
@@ -4658,7 +4658,7 @@
               <w:pStyle w:val="TableText"/>
             </w:pPr>
             <w:r>
-              <w:t xml:space="preserve">2026-09-24 09:36:10</w:t>
+              <w:t xml:space="preserve">2026-09-24 12:39:39</w:t>
             </w:r>
           </w:p>
         </w:tc>
@@ -5818,7 +5818,7 @@
       <w:jc w:val="center"/>
     </w:pPr>
     <w:r>
-      <w:t xml:space="preserve">Commit dde75c0 | 2026-09-24 09:36:10 UTC   |   Page </w:t>
+      <w:t xml:space="preserve">Commit 1261f5f | 2026-09-24 12:39:39 UTC   |   Page </w:t>
     </w:r>
     <w:r>
       <w:fldChar w:fldCharType="begin"/>

</xml_diff>